<commit_message>
Fill in author, remove report HTML
</commit_message>
<xml_diff>
--- a/docs/GameSystem_Report.docx
+++ b/docs/GameSystem_Report.docx
@@ -34,7 +34,7 @@
           <w:b w:val="0"/>
           <w:sz w:val="28"/>
         </w:rPr>
-        <w:t>Виконав(ла): ____________________, група ______</w:t>
+        <w:t>Виконав: Воскобойников Марк, група КН-31</w:t>
       </w:r>
     </w:p>
     <w:p>
@@ -44,7 +44,7 @@
           <w:b w:val="0"/>
           <w:sz w:val="28"/>
         </w:rPr>
-        <w:t>Дата: ____________</w:t>
+        <w:t>Дата: 13.09.2026</w:t>
       </w:r>
     </w:p>
     <w:p>

</xml_diff>

<commit_message>
Add repo link at the end of the report
</commit_message>
<xml_diff>
--- a/docs/GameSystem_Report.docx
+++ b/docs/GameSystem_Report.docx
@@ -1076,6 +1076,27 @@
         <w:t>Ігровий код розділено на модулі, класи - за єдиною відповідальністю; стан захищено модифікаторами доступу та валідацією; сторонній функціонал винесено в окремі класи; ходом гри керує Game. Поведінка програми після рефактора не змінилась.</w:t>
       </w:r>
     </w:p>
+    <w:p>
+      <w:r>
+        <w:rPr>
+          <w:rFonts w:ascii="Times New Roman" w:hAnsi="Times New Roman"/>
+          <w:sz w:val="28"/>
+        </w:rPr>
+        <w:t xml:space="preserve">Репозиторій з кодом: </w:t>
+      </w:r>
+      <w:hyperlink r:id="rId10">
+        <w:r>
+          <w:rPr>
+            <w:rFonts w:ascii="Times New Roman" w:hAnsi="Times New Roman" w:cs="Times New Roman"/>
+            <w:sz w:val="28"/>
+            <w:szCs w:val="28"/>
+            <w:color w:val="0563C1"/>
+            <w:u w:val="single"/>
+          </w:rPr>
+          <w:t>https://github.com/mvockob/StudentProjectOOP</w:t>
+        </w:r>
+      </w:hyperlink>
+    </w:p>
     <w:sectPr>
       <w:pgSz w:w="11906" w:h="16838"/>
       <w:pgMar w:top="1134" w:right="1134" w:bottom="1134" w:left="1134" w:header="720" w:footer="720" w:gutter="0"/>

</xml_diff>